<commit_message>
Make the submission production-ready and evidence-complete
- Configurable workflow profiles (lung_biopsy, invoice_payment) replace the
  fixed decide/check path; the model extracts, Python decides.
- Numbers must belong to their own measurement; thresholds are not results.
- Approval requires MRN on clinical documents and the requested procedure,
  CPT codes and service date; read or model failures exit 1.
- Summary matches the assignment output, with a case-specific reason.
- Committed Hebrew and English outputs for both medical cases in ai/results.
- Rewritten README, Hebrew submission and DOCX answer; CI runs pytest.
- Removed stale logs, unused demo data and legacy modules.

Co-authored-by: Cursor <cursoragent@cursor.com>
</commit_message>
<xml_diff>
--- a/ai/task_ai_approval.docx
+++ b/ai/task_ai_approval.docx
@@ -3157,147 +3157,150 @@
       <w:pPr/>
       <w:r>
         <w:rPr/>
-        <w:t xml:space="preserve">ההמלצה היא APPROVE. דו״ח ה־CT מתאר נודול חלקי בגודל 18×15 מ״מ באונה הימנית העליונה, עם מאפיינים חשודים ו־Lung-RADS 4B. הסיכום הרפואי ממליץ על דגימת רקמה. המסמכים מסבירים שהגישה הברונכוסקופית הרובוטית מתאימה למיקום הנגע ומפחיתה את סיכון חזה האוויר ביחס לביופסיה דרך דופן בית החזה, בפרט על רקע COPD. בדיקות המעבדה ותפקודי הריאה אינן מצביעות על מניעה ברורה.</w:t>
+        <w:t xml:space="preserve">ההמלצה היא APPROVE. דו״ח ה־CT מתאר נודול סולידי חלקית בגודל 18×15 מ״מ באונה הימנית העליונה, בסגמנט האחורי, עם שוליים משוננים, מרכיב סולידי של כ־12 מ״מ ו־Lung-RADS 4B. ב־PET-CT הנודול קולט FDG עם SUVmax של 4.2. הסיכום הרפואי ממליץ על דגימת רקמה. המסמכים מסבירים שהגישה הברונכוסקופית הרובוטית מתאימה למיקום הנגע ומפחיתה את סיכון חזה האוויר ביחס לביופסיה דרך דופן בית החזה, בפרט על רקע COPD. בדיקות המעבדה והקרישה תקינות, ותפקודי הריאה אינם מצביעים על מניעה ברורה.</w:t>
       </w:r>
     </w:p>
     <w:p>
       <w:pPr/>
       <w:r>
         <w:rPr/>
-        <w:t xml:space="preserve">נימוק המערכת: The clinical findings support tissue diagnosis of a suspicious right upper lobe pulmonary nodule (Lung-RADS 4B), and the requested procedure is appropriate based on the lesion location and the patient's COPD (FEV1 62% predicted).</w:t>
+        <w:t xml:space="preserve">נימוק המערכת: הממצאים הקליניים תומכים בדגימת רקמה מנודול חשוד (18 x 15 mm, Lung-RADS 4B). הפרוצדורה המבוקשת מתאימה למיקום הנגע ולמצב הריאתי המתואר במסמכים (FEV1 62% מהצפוי, DLCO 58% מהצפוי), ובדיקות המעבדה ותפקודי הריאה אינן מצביעות על מניעה ברורה.</w:t>
       </w:r>
     </w:p>
     <w:p>
       <w:pPr/>
       <w:r>
         <w:rPr/>
-        <w:t xml:space="preserve">ה־JSON המלא של התיק שסופק נמצא בקובץ result.json בתיקיית הפרויקט.</w:t>
-      </w:r>
-    </w:p>
-    <w:p>
-      <w:pPr>
-        <w:pStyle w:val="21"/>
-      </w:pPr>
-      <w:r>
-        <w:rPr/>
-        <w:t xml:space="preserve">בדיקה נוספת עם מודל Gemma 4 מקומי</w:t>
+        <w:t xml:space="preserve">התקציר שהוחזר: מספר בקשה PA-2025-847291; המטופלת Margaret A. Johnson, תאריך לידה 1952-03-15, MRN 847291; הפרוצדורה Robotic-Assisted Transbronchial Lung Biopsy, קודי CPT 31629, 31632, 77012, תאריך שירות 2025-12-10; נודול 18 x 15 mm, Lung-RADS 4B, SUVmax 4.2, FEV1 62%, DLCO 58%, מצב קרישה Normal.</w:t>
       </w:r>
     </w:p>
     <w:p>
       <w:pPr/>
       <w:r>
         <w:rPr/>
-        <w:t xml:space="preserve">נבדק גם תיק בדיוני ונפרד עבור Taylor Sample: נודול חלק בגודל 6 מ״מ באונה הימנית האמצעית, יציב במשך 24 חודשים, Lung-RADS 2, עם המלצה למעקב הדמייתי שנתי וללא המלצה לדגימת רקמה. המעבדה ותפקודי הריאה תקינים.</w:t>
+        <w:t xml:space="preserve">הפלט המלא, בעברית ובאנגלית, נמצא בתיקייה ai/results/supplied בפרויקט. הוא כולל את קובץ התוצאה, את העובדות המאומתות עם ציטוט ומספר עמוד, את הטקסט שנקרא ואת כל תשובות המודל.</w:t>
+      </w:r>
+    </w:p>
+    <w:p>
+      <w:pPr>
+        <w:pStyle w:val="21"/>
+      </w:pPr>
+      <w:r>
+        <w:rPr/>
+        <w:t xml:space="preserve">בדיקה נוספת על תיק בדיוני</w:t>
       </w:r>
     </w:p>
     <w:p>
       <w:pPr/>
       <w:r>
         <w:rPr/>
-        <w:t xml:space="preserve">ההרצה המקומית עם gemma4:latest החזירה MANUAL_REVIEW. הכללים Suspicious nodule requiring investigation ו־Tissue sampling recommended לא הוכחו; כלל התאמת הפרוצדורה וכלל הבדיקות המקדימות סומנו כמתקיימים. המודל לא החזיר את האמירות השליליות במסמכים כעובדות מובנות, ולכן הקוד נשאר שמרני ולא אישר ללא ראיה חיובית לכללי האישור. לא הופיעה בעיית התאמת זהות בתוצאה הסופית.</w:t>
+        <w:t xml:space="preserve">נבדק גם תיק בדיוני ונפרד עבור Taylor Sample: נודול מוצק וחלק בגודל 6 מ״מ באונה הימנית האמצעית, יציב במשך 24 חודשים, Lung-RADS 2, עם המלצה למעקב הדמייתי שנתי וללא המלצה לדגימת רקמה. התוצאה היא MANUAL_REVIEW, כי הכללים ״נודול חשוד המצריך בירור״ ו־״הומלצה דגימת רקמה״ אינם נתמכים. הפלט המלא נמצא בתיקייה ai/results/alternate.</w:t>
+      </w:r>
+    </w:p>
+    <w:p>
+      <w:pPr>
+        <w:pStyle w:val="21"/>
+      </w:pPr>
+      <w:r>
+        <w:rPr/>
+        <w:t xml:space="preserve">אופן קבלת ההמלצה</w:t>
       </w:r>
     </w:p>
     <w:p>
       <w:pPr/>
       <w:r>
         <w:rPr/>
-        <w:t xml:space="preserve">ה־JSON המלא לתיק הנוסף נמצא בקובץ ai/alternate_case/result.json. חומרי התיק הבדיוני וקובץ בניית ה־PDF נמצאים בתיקייה ai/alternate_case.</w:t>
-      </w:r>
-    </w:p>
-    <w:p>
-      <w:pPr>
-        <w:pStyle w:val="21"/>
-      </w:pPr>
-      <w:r>
-        <w:rPr/>
-        <w:t xml:space="preserve">אופן קבלת ההמלצה והוראות הרצה</w:t>
+        <w:t xml:space="preserve">קריאה: הטקסט נקרא מכל מסמך יחד עם מספר העמוד, ולכל קובץ מחושבת טביעת hash. עמוד סרוק נכשל במפורש, אלא אם הופעל OCR מקומי.</w:t>
       </w:r>
     </w:p>
     <w:p>
       <w:pPr/>
       <w:r>
         <w:rPr/>
-        <w:t xml:space="preserve">המערכת מחלצת טקסט מכל PDF, שולחת ל־Gemma שאלה נפרדת לכל שדה ומבקשת ציטוט מדויק. קוד הבדיקה מאמת שהציטוט מופיע במסמך, מאחד פורמטים של תאריכים ומשווה פרטי זהות. קוד ההחלטה מחזיר APPROVE רק כאשר כל ארבעת הכללים נתמכים ואין בעיה חוסמת; בכל מצב אחר מוחזר MANUAL_REVIEW. המודל מחלץ מידע אך אינו מקבל את החלטת האישור.</w:t>
+        <w:t xml:space="preserve">חילוץ: כל שדה נשלח למודל Gemma 4 המקומי, דרך Ollama, בקריאה נפרדת עם סכמת JSON, טמפרטורה 0 ו־seed קבוע. המודל מחזיר ערך וציטוט מדויק, וכל ערך מועמד נשמר.</w:t>
       </w:r>
     </w:p>
     <w:p>
       <w:pPr/>
       <w:r>
         <w:rPr/>
-        <w:t xml:space="preserve">להרצת התיק שסופק: ollama pull gemma4; לאחר התקנת התלויות, python -m approval case.json --model gemma4 --output result.json. להרצת התיק הנוסף: python ai/alternate_case/build_pdfs.py ולאחר מכן python -m approval ai/alternate_case/case.json --model gemma4:latest --output ai/alternate_case/result.json.</w:t>
-      </w:r>
-    </w:p>
-    <w:p>
-      <w:pPr>
-        <w:pStyle w:val="21"/>
-      </w:pPr>
-      <w:r>
-        <w:rPr/>
-        <w:t xml:space="preserve">ממצאי סקירת קוד</w:t>
-      </w:r>
-    </w:p>
-    <w:p>
-      <w:pPr>
-        <w:numPr>
-          <w:ilvl w:val="0"/>
-          <w:numId w:val="19"/>
-        </w:numPr>
-      </w:pPr>
-      <w:r>
-        <w:rPr/>
-        <w:t xml:space="preserve">בדיקת זהות אינה מחייבת MRN בכל מסמך, אף שה־README מתאר בדיקה של שם, תאריך לידה ו־MRN. ב־approval/check.py נדרשים בכל מסמך רק שם ותאריך לידה.</w:t>
-      </w:r>
-    </w:p>
-    <w:p>
-      <w:pPr>
-        <w:numPr>
-          <w:ilvl w:val="0"/>
-          <w:numId w:val="19"/>
-        </w:numPr>
-      </w:pPr>
-      <w:r>
-        <w:rPr/>
-        <w:t xml:space="preserve">בדיקת ציטוטים מספריים מוודאת שהמספר מופיע בציטוט, אך אינה קושרת אותו לשדה. כך ערך FEV1 עלול לעבור אימות אם אותו מספר מופיע בציטוט עבור מדד אחר.</w:t>
-      </w:r>
-    </w:p>
-    <w:p>
-      <w:pPr>
-        <w:numPr>
-          <w:ilvl w:val="0"/>
-          <w:numId w:val="19"/>
-        </w:numPr>
-      </w:pPr>
-      <w:r>
-        <w:rPr/>
-        <w:t xml:space="preserve">שדות בקשה כגון הפרוצדורה, קודי CPT ותאריך השירות אינם נדרשים במפורש לפני APPROVE; ההחלטה ב־approval/decide.py מסתמכת על דגל procedure_supported.</w:t>
-      </w:r>
-    </w:p>
-    <w:p>
-      <w:pPr>
-        <w:numPr>
-          <w:ilvl w:val="0"/>
-          <w:numId w:val="19"/>
-        </w:numPr>
-      </w:pPr>
-      <w:r>
-        <w:rPr/>
-        <w:t xml:space="preserve">ציטוט שמופיע במסמך אינו מוכיח שהערך שחולץ תואם למשמעות הציטוט. בתיק הנוסף Gemma השמיט קביעות שליליות מפורשות, והמערכת העבירה את התיק לסקירה ידנית באופן שמרני.</w:t>
-      </w:r>
-    </w:p>
-    <w:p>
-      <w:pPr>
-        <w:pStyle w:val="21"/>
-      </w:pPr>
-      <w:r>
-        <w:rPr/>
-        <w:t xml:space="preserve">מגבלות ושיפורים אפשריים</w:t>
+        <w:t xml:space="preserve">אימות: הקוד בודק שהציטוט מופיע במסמך ושמספר שייך למדד של השדה. כך ערך DLCO אינו יכול לעבור כ־FEV1, וסף כמו ״FEV1 &gt;60%״ אינו נחשב תוצאה. הקוד גם מאחד תאריכים ומשווה שם, תאריך לידה ו־MRN בין המסמכים.</w:t>
       </w:r>
     </w:p>
     <w:p>
       <w:pPr/>
       <w:r>
         <w:rPr/>
-        <w:t xml:space="preserve">הפתרון נבדק כאן על התיק שסופק ועל תיק הדגמה בדיוני אחד בלבד, ולכן זו אינה הערכת דיוק רחבה. הוא קורא PDFs עם שכבת טקסט בלבד ואינו מבצע OCR למסמכים סרוקים. חילוץ שדה־אחר־שדה עשוי להיות איטי. שיפורים אפשריים הם לחייב את כל שדות הבקשה והזהות הקריטיים, לבדוק התאמה סמנטית בין ערך לציטוט, ולהוסיף מערך הערכה של מסמכים חסרים, זהויות לא תואמות, סתירות וראיות שליליות. זהו כלי הדגמה לתמיכה בבדיקה אנושית ואינו מערכת קלינית מאומתת.</w:t>
+        <w:t xml:space="preserve">החלטה: קוד Python, ולא המודל, מפעיל את ארבעת כללי המטלה. APPROVE מתקבל רק כשכל כלל נתמך בראיה מאומתת, כל המסמכים קיימים, הזהות תואמת, הפרוצדורה, קודי ה־CPT ותאריך השירות חולצו, ואין התוויית נגד או בעיה חוסמת. בכל מצב אחר מוחזר MANUAL_REVIEW, עם פירוט הסיבות.</w:t>
+      </w:r>
+    </w:p>
+    <w:p>
+      <w:pPr>
+        <w:pStyle w:val="21"/>
+      </w:pPr>
+      <w:r>
+        <w:rPr/>
+        <w:t xml:space="preserve">הוראות הרצה</w:t>
+      </w:r>
+    </w:p>
+    <w:p>
+      <w:pPr/>
+      <w:r>
+        <w:rPr/>
+        <w:t xml:space="preserve">נדרשים Python 3.11 ומעלה ו־Ollama. מריצים ollama pull gemma4, מתקינים את הפרויקט עם python -m pip install -e . ואז מריצים python -m approval case.json --language he --output-dir runs/medical. האפשרות --language en מפיקה הסבר באנגלית. הוראות מלאות נמצאות בקובץ README.md.</w:t>
+      </w:r>
+    </w:p>
+    <w:p>
+      <w:pPr>
+        <w:pStyle w:val="21"/>
+      </w:pPr>
+      <w:r>
+        <w:rPr/>
+        <w:t xml:space="preserve">בדיקות</w:t>
+      </w:r>
+    </w:p>
+    <w:p>
+      <w:pPr/>
+      <w:r>
+        <w:rPr/>
+        <w:t xml:space="preserve">64 בדיקות אוטומטיות מריצות את קוראי המסמכים, את האימות, את הכללים ואת רישום ההרצה, ומחליפות רק את הקריאה למודל. בנוסף בוצעה הרצה חיה מול Gemma 4 של עשרה תרחישים, בעברית ובאנגלית: התיק שסופק, תיק רפואי בעברית, התיק הבדיוני ושבעה תרחישי חשבונית, כולל מסמך סרוק. כל התרחישים החזירו את התוצאה הצפויה, והתוצאות בעברית ובאנגלית היו זהות.</w:t>
+      </w:r>
+    </w:p>
+    <w:p>
+      <w:pPr>
+        <w:pStyle w:val="21"/>
+      </w:pPr>
+      <w:r>
+        <w:rPr/>
+        <w:t xml:space="preserve">מגבלות ושיפורים אפשריים</w:t>
+      </w:r>
+    </w:p>
+    <w:p>
+      <w:pPr/>
+      <w:r>
+        <w:rPr/>
+        <w:t xml:space="preserve">ציטוט מאומת מוכיח שהטקסט קיים ושמספר קשור למדד שלו, אך אינו מוכיח שהמודל הבין את המשפט. המודל עשוי להשמיט קביעה שלילית; במקרה כזה התוצאה נשארת MANUAL_REVIEW.</w:t>
+      </w:r>
+    </w:p>
+    <w:p>
+      <w:pPr/>
+      <w:r>
+        <w:rPr/>
+        <w:t xml:space="preserve">כשנמצאו כמה ערכים מאומתים לאותו שדה, למשל נודול שני ושפיר, התקציר מציג את הערך הראשון שמופיע במסמכים ומוסיף אזהרה. ההחלטה אינה תלויה בבחירה הזו.</w:t>
+      </w:r>
+    </w:p>
+    <w:p>
+      <w:pPr/>
+      <w:r>
+        <w:rPr/>
+        <w:t xml:space="preserve">הפתרון נבדק על התיק שסופק, על תיק בדיוני אחד ועל דוגמאות בדיוניות, ולכן זו אינה הערכת דיוק. תיק רפואי נמשך שתיים עד שלוש דקות, כי כל שדה נשאל בנפרד.</w:t>
+      </w:r>
+    </w:p>
+    <w:p>
+      <w:pPr/>
+      <w:r>
+        <w:rPr/>
+        <w:t xml:space="preserve">עם זמן נוסף כדאי להוסיף מערך הערכה רחב עם מסמכים חסרים, זהויות שאינן תואמות, סתירות וראיות שליליות, בדיקה סמנטית בין ערך לציטוט, וניסיון חוזר אוטומטי לקריאה שנכשלה. זהו כלי הדגמה התומך בבדיקה אנושית, ואינו מערכת קלינית מאומתת.</w:t>
       </w:r>
     </w:p>
     <w:sectPr>

</xml_diff>